<commit_message>
Pair programming rationale changes and big fixes to tests
</commit_message>
<xml_diff>
--- a/Docs/Design_Rationale_report.docx
+++ b/Docs/Design_Rationale_report.docx
@@ -570,7 +570,19 @@
         <w:t>test</w:t>
       </w:r>
       <w:r>
-        <w:t>ing public methods, then integration and systems testing combinations of these methods and the final CardGame executable class.</w:t>
+        <w:t xml:space="preserve">ing public methods, then integration and systems testing combinations of these methods and the final </w:t>
+      </w:r>
+      <w:r>
+        <w:t>‘</w:t>
+      </w:r>
+      <w:r>
+        <w:t>CardGame</w:t>
+      </w:r>
+      <w:r>
+        <w:t>’</w:t>
+      </w:r>
+      <w:r>
+        <w:t xml:space="preserve"> executable class.</w:t>
       </w:r>
       <w:r>
         <w:t xml:space="preserve"> Private methods </w:t>
@@ -606,16 +618,19 @@
         <w:t xml:space="preserve"> unit tests (‘PlayerTest.java’, ‘DeckTest.java’)</w:t>
       </w:r>
       <w:r>
-        <w:t xml:space="preserve"> and our</w:t>
-      </w:r>
-      <w:r>
-        <w:t xml:space="preserve"> integration</w:t>
-      </w:r>
-      <w:r>
-        <w:t xml:space="preserve"> &amp; system</w:t>
-      </w:r>
-      <w:r>
-        <w:t xml:space="preserve"> tests (‘IntegrationTest.java’)</w:t>
+        <w:t xml:space="preserve">, </w:t>
+      </w:r>
+      <w:r>
+        <w:t>ou</w:t>
+      </w:r>
+      <w:r>
+        <w:t>r</w:t>
+      </w:r>
+      <w:r>
+        <w:t xml:space="preserve"> integration tests (‘IntegrationTest.java’)</w:t>
+      </w:r>
+      <w:r>
+        <w:t xml:space="preserve"> and our system tests (‘CardGameTest.java’)</w:t>
       </w:r>
       <w:r>
         <w:t>.</w:t>
@@ -705,10 +720,27 @@
         <w:t>valid/invalid input handling and output file contents.</w:t>
       </w:r>
       <w:r>
-        <w:t xml:space="preserve"> This class also implements </w:t>
-      </w:r>
-      <w:r>
-        <w:t>system tests by testing the input/output handling and end-to-end game testing.</w:t>
+        <w:t xml:space="preserve"> </w:t>
+      </w:r>
+    </w:p>
+    <w:p>
+      <w:r>
+        <w:t xml:space="preserve">Finally, we implemented a ‘CardGameTest.java’ test class which system tests the </w:t>
+      </w:r>
+      <w:r>
+        <w:t>implementation</w:t>
+      </w:r>
+      <w:r>
+        <w:t>, testing for valid</w:t>
+      </w:r>
+      <w:r>
+        <w:t>/</w:t>
+      </w:r>
+      <w:r>
+        <w:t>invalid player count &amp; pack files, and testing that the output files contain expected lines such as the winning player and the initial hands of each player.</w:t>
+      </w:r>
+      <w:r>
+        <w:t xml:space="preserve"> </w:t>
       </w:r>
     </w:p>
     <w:p>
@@ -1337,7 +1369,6 @@
   <w:style w:type="character" w:default="1" w:styleId="DefaultParagraphFont">
     <w:name w:val="Default Paragraph Font"/>
     <w:uiPriority w:val="1"/>
-    <w:semiHidden/>
     <w:unhideWhenUsed/>
   </w:style>
   <w:style w:type="table" w:default="1" w:styleId="TableNormal">

</xml_diff>

<commit_message>
Redo last commit: commit was incomplete
</commit_message>
<xml_diff>
--- a/Docs/Design_Rationale_report.docx
+++ b/Docs/Design_Rationale_report.docx
@@ -175,7 +175,13 @@
     </w:p>
     <w:p>
       <w:r>
-        <w:t>We implement the ring topology by ensuring that each player n draws from deck n and discards to deck n+1, with the exception of the final player, which discards to deck , completing the ring topology specified in the brie</w:t>
+        <w:t xml:space="preserve">We implement the ring topology by ensuring that each player n draws from deck n and discards to deck n+1, with the exception of the final player, which discards to deck </w:t>
+      </w:r>
+      <w:r>
+        <w:t>1</w:t>
+      </w:r>
+      <w:r>
+        <w:t>, completing the ring topology specified in the brie</w:t>
       </w:r>
       <w:r>
         <w:t>f.</w:t>
@@ -711,13 +717,16 @@
         <w:t xml:space="preserve"> integration testing by testing</w:t>
       </w:r>
       <w:r>
-        <w:t xml:space="preserve"> interactions between classes. Within this class, we test invariants such as card conservation throughout operations on players and decks (as specified in the brief), win detection (a player will correctly loop draw/discard actions while constantly checking if it has a winning hand and stop when it draws the final card of a winning hand),</w:t>
+        <w:t xml:space="preserve"> interactions between classes. Within this class, we test invariants such as card conservation throughout operations on players and decks (as specified in the brief), win detection (a player will correctly loop draw/discard actions while constantly checking if it has a winning hand and stop when it draws the final card of a winning hand)</w:t>
+      </w:r>
+      <w:r>
+        <w:t xml:space="preserve"> and</w:t>
       </w:r>
       <w:r>
         <w:t xml:space="preserve"> </w:t>
       </w:r>
       <w:r>
-        <w:t>valid/invalid input handling and output file contents.</w:t>
+        <w:t>output file contents.</w:t>
       </w:r>
       <w:r>
         <w:t xml:space="preserve"> </w:t>
@@ -731,13 +740,7 @@
         <w:t>implementation</w:t>
       </w:r>
       <w:r>
-        <w:t>, testing for valid</w:t>
-      </w:r>
-      <w:r>
-        <w:t>/</w:t>
-      </w:r>
-      <w:r>
-        <w:t>invalid player count &amp; pack files, and testing that the output files contain expected lines such as the winning player and the initial hands of each player.</w:t>
+        <w:t>, testing that the output files contain expected lines such as the winning player and the initial hands of each player.</w:t>
       </w:r>
       <w:r>
         <w:t xml:space="preserve"> </w:t>
@@ -1369,6 +1372,7 @@
   <w:style w:type="character" w:default="1" w:styleId="DefaultParagraphFont">
     <w:name w:val="Default Paragraph Font"/>
     <w:uiPriority w:val="1"/>
+    <w:semiHidden/>
     <w:unhideWhenUsed/>
   </w:style>
   <w:style w:type="table" w:default="1" w:styleId="TableNormal">

</xml_diff>